<commit_message>
docs: update visao estrategica v2 - telemedicina CFM 2.314/2022 + clone video IA
</commit_message>
<xml_diff>
--- a/docs/visao-audio-clone-ia.docx
+++ b/docs/visao-audio-clone-ia.docx
@@ -8,9 +8,6 @@
         <w:jc w:val="center"/>
       </w:pPr>
       <w:r>
-        <w:rPr>
-          <w:color w:val="7B3FE4"/>
-        </w:rPr>
         <w:t>Hormone Ecosystem</w:t>
       </w:r>
     </w:p>
@@ -19,10 +16,7 @@
         <w:jc w:val="center"/>
       </w:pPr>
       <w:r>
-        <w:rPr>
-          <w:color w:val="71717A"/>
-        </w:rPr>
-        <w:t>Visão Estratégica — Presença do Dr. Vinícius + Expansão com IA</w:t>
+        <w:t>Visao Estrategica v2 — Audio + Clone IA + Telemedicina Legal</w:t>
       </w:r>
     </w:p>
     <w:p>
@@ -30,11 +24,7 @@
         <w:jc w:val="center"/>
       </w:pPr>
       <w:r>
-        <w:rPr>
-          <w:color w:val="999999"/>
-          <w:sz w:val="20"/>
-        </w:rPr>
-        <w:t>Data: 19/06/2026  |  Responsável: Dr. Vinícius Cechella</w:t>
+        <w:t>19/06/2026 | Dr. Vinicius Cechella</w:t>
       </w:r>
     </w:p>
     <w:p/>
@@ -46,15 +36,12 @@
         <w:rPr>
           <w:color w:val="7B3FE4"/>
         </w:rPr>
-        <w:t>1. A Ideia: Áudio do Dr. Vinícius no Início da Conversa</w:t>
+        <w:t>1. Audio do Dr. Vinicius no Inicio da Conversa</w:t>
       </w:r>
     </w:p>
     <w:p>
       <w:r>
-        <w:rPr>
-          <w:sz w:val="22"/>
-        </w:rPr>
-        <w:t>Durante a sessão de desenvolvimento, surgiu uma ideia estratégica poderosa: gravar um áudio com a voz do Dr. Vinícius Cechella para ser disparado automaticamente no início de cada conversa com a Ana (agente IA).</w:t>
+        <w:t>Gravar audio com a voz do Dr. Vinicius para disparar automaticamente no inicio de cada conversa com a Ana (agente IA).</w:t>
       </w:r>
     </w:p>
     <w:p/>
@@ -66,7 +53,7 @@
         <w:rPr>
           <w:color w:val="333333"/>
         </w:rPr>
-        <w:t>Script sugerido para o áudio:</w:t>
+        <w:t>Script sugerido:</w:t>
       </w:r>
     </w:p>
     <w:p>
@@ -78,10 +65,9 @@
           <w:i/>
           <w:color w:val="555555"/>
         </w:rPr>
-        <w:t>"Olá, aqui é o Dr. Vinícius Cechella. Obrigado por estar conversando com a Ana hoje. Ela é minha consultora e tem toda a minha confiança para te ajudar. Estou aqui no consultório acompanhando cada conversa. Se precisar de mim em algum momento, é só falar. Pode falar com ela à vontade — você está em boas mãos!"</w:t>
+        <w:t>"Ola, aqui e o Dr. Vinicius Cechella. Obrigado por estar conversando com a Ana hoje. Ela e minha consultora e tem toda a minha confianca. Estou aqui no consultorio acompanhando cada conversa. Se precisar de mim, e so falar!"</w:t>
       </w:r>
     </w:p>
-    <w:p/>
     <w:p>
       <w:pPr>
         <w:pStyle w:val="Heading2"/>
@@ -90,7 +76,7 @@
         <w:rPr>
           <w:color w:val="333333"/>
         </w:rPr>
-        <w:t>Por que isso é poderoso:</w:t>
+        <w:t>Por que e poderoso:</w:t>
       </w:r>
     </w:p>
     <w:p>
@@ -98,7 +84,7 @@
         <w:pStyle w:val="ListBullet"/>
       </w:pPr>
       <w:r>
-        <w:t>Humaniza a conversa — o lead percebe que há um médico real por trás do atendimento</w:t>
+        <w:t>Humaniza a conversa — lead percebe que ha um medico real por tras</w:t>
       </w:r>
     </w:p>
     <w:p>
@@ -106,7 +92,7 @@
         <w:pStyle w:val="ListBullet"/>
       </w:pPr>
       <w:r>
-        <w:t>Gera confiança imediata — o Dr. Vinícius endossa e autoriza a Ana pessoalmente</w:t>
+        <w:t>Gera confianca imediata — Dr. Vinicius endossa e autoriza a Ana</w:t>
       </w:r>
     </w:p>
     <w:p>
@@ -114,7 +100,7 @@
         <w:pStyle w:val="ListBullet"/>
       </w:pPr>
       <w:r>
-        <w:t>Elimina as duas maiores objeções do início: "Isso é um bot?" e "Posso confiar?"</w:t>
+        <w:t>Elimina objecoes: "Isso e um bot?" e "Posso confiar?"</w:t>
       </w:r>
     </w:p>
     <w:p>
@@ -122,18 +108,9 @@
         <w:pStyle w:val="ListBullet"/>
       </w:pPr>
       <w:r>
-        <w:t>Diferencia totalmente de outros chatbots do mercado</w:t>
+        <w:t>Diferencia totalmente de outros chatbots</w:t>
       </w:r>
     </w:p>
-    <w:p>
-      <w:pPr>
-        <w:pStyle w:val="ListBullet"/>
-      </w:pPr>
-      <w:r>
-        <w:t>Equivale a um médico aparecer pessoalmente para receber o paciente antes de passar para a recepcionista</w:t>
-      </w:r>
-    </w:p>
-    <w:p/>
     <w:p>
       <w:pPr>
         <w:pStyle w:val="Heading2"/>
@@ -142,23 +119,7 @@
         <w:rPr>
           <w:color w:val="333333"/>
         </w:rPr>
-        <w:t>Onde disparar no fluxo:</w:t>
-      </w:r>
-    </w:p>
-    <w:p>
-      <w:r>
-        <w:rPr>
-          <w:sz w:val="22"/>
-        </w:rPr>
-        <w:t>O melhor momento é no INÍCIO — quando o lead envia a primeira mensagem, antes da Ana iniciar a Etapa 1 (Apresentação). Isso resolve a desconfiança antes mesmo de ela começar.</w:t>
-      </w:r>
-    </w:p>
-    <w:p>
-      <w:r>
-        <w:rPr>
-          <w:sz w:val="22"/>
-        </w:rPr>
-        <w:t>Fluxo com o áudio:</w:t>
+        <w:t>Fluxo:</w:t>
       </w:r>
     </w:p>
     <w:p>
@@ -174,7 +135,7 @@
         <w:pStyle w:val="ListBullet"/>
       </w:pPr>
       <w:r>
-        <w:t>2. Áudio do Dr. Vinícius dispara automaticamente via n8n + Z-API</w:t>
+        <w:t>2. Audio do Dr. Vinicius dispara automaticamente (n8n + Z-API)</w:t>
       </w:r>
     </w:p>
     <w:p>
@@ -182,7 +143,7 @@
         <w:pStyle w:val="ListBullet"/>
       </w:pPr>
       <w:r>
-        <w:t>3. Ana entra com a Etapa 1 (Apresentação) logo na sequência</w:t>
+        <w:t>3. Ana entra com Etapa 1 na sequencia</w:t>
       </w:r>
     </w:p>
     <w:p/>
@@ -194,15 +155,62 @@
         <w:rPr>
           <w:color w:val="7B3FE4"/>
         </w:rPr>
-        <w:t>2. A Visão: Clones do Dr. Vinícius em Escala</w:t>
+        <w:t>2. Clone em Video IA — Marketing, Area do Paciente e Landing Page</w:t>
       </w:r>
     </w:p>
     <w:p>
       <w:r>
         <w:rPr>
-          <w:sz w:val="22"/>
+          <w:b/>
+          <w:color w:val="008000"/>
         </w:rPr>
-        <w:t>A visão de longo prazo discutida é criar múltiplos "clones" do Dr. Vinícius operando simultaneamente, cada um atendendo uma região ou nicho diferente.</w:t>
+        <w:t>STATUS LEGAL: 100% PERMITIDO — Uso para marketing e conteudo nao e consulta medica.</w:t>
+      </w:r>
+    </w:p>
+    <w:p/>
+    <w:p>
+      <w:r>
+        <w:t>O Dr. Vinicius pode criar um clone identico usando HeyGen, Synthesia ou D-ID para uso em:</w:t>
+      </w:r>
+    </w:p>
+    <w:p>
+      <w:pPr>
+        <w:pStyle w:val="ListBullet"/>
+      </w:pPr>
+      <w:r>
+        <w:t>Landing page — video de apresentacao do implante hormonal</w:t>
+      </w:r>
+    </w:p>
+    <w:p>
+      <w:pPr>
+        <w:pStyle w:val="ListBullet"/>
+      </w:pPr>
+      <w:r>
+        <w:t>Area do paciente — boas-vindas personalizadas</w:t>
+      </w:r>
+    </w:p>
+    <w:p>
+      <w:pPr>
+        <w:pStyle w:val="ListBullet"/>
+      </w:pPr>
+      <w:r>
+        <w:t>WhatsApp — video curto endossando a Ana no inicio da conversa</w:t>
+      </w:r>
+    </w:p>
+    <w:p>
+      <w:pPr>
+        <w:pStyle w:val="ListBullet"/>
+      </w:pPr>
+      <w:r>
+        <w:t>Pos-consulta — clone explicando proximos passos do tratamento</w:t>
+      </w:r>
+    </w:p>
+    <w:p>
+      <w:pPr>
+        <w:pStyle w:val="ListBullet"/>
+      </w:pPr>
+      <w:r>
+        <w:t>Conteudo educativo em multiplos idiomas e formatos</w:t>
       </w:r>
     </w:p>
     <w:p/>
@@ -214,7 +222,7 @@
         <w:rPr>
           <w:color w:val="333333"/>
         </w:rPr>
-        <w:t>Como ficaria na prática:</w:t>
+        <w:t>Como funciona:</w:t>
       </w:r>
     </w:p>
     <w:p>
@@ -222,7 +230,7 @@
         <w:pStyle w:val="ListBullet"/>
       </w:pPr>
       <w:r>
-        <w:t>Dr. Vinícius Clone 1 → atendendo leads do Sul do Brasil</w:t>
+        <w:t>1. Gravar 10-15 minutos de video com boa iluminacao e audio</w:t>
       </w:r>
     </w:p>
     <w:p>
@@ -230,7 +238,7 @@
         <w:pStyle w:val="ListBullet"/>
       </w:pPr>
       <w:r>
-        <w:t>Dr. Vinícius Clone 2 → atendendo leads do Sudeste</w:t>
+        <w:t>2. Subir no HeyGen — cria o clone digital identico</w:t>
       </w:r>
     </w:p>
     <w:p>
@@ -238,7 +246,7 @@
         <w:pStyle w:val="ListBullet"/>
       </w:pPr>
       <w:r>
-        <w:t>Dr. Vinícius Clone 3 → atendendo indicações da rede de referidos</w:t>
+        <w:t>3. Digitar qualquer texto — o clone fala com sua voz e expressoes</w:t>
       </w:r>
     </w:p>
     <w:p>
@@ -246,15 +254,7 @@
         <w:pStyle w:val="ListBullet"/>
       </w:pPr>
       <w:r>
-        <w:t>Todos com a mesma voz, personalidade e protocolo do Dr. Vinícius</w:t>
-      </w:r>
-    </w:p>
-    <w:p>
-      <w:pPr>
-        <w:pStyle w:val="ListBullet"/>
-      </w:pPr>
-      <w:r>
-        <w:t>O médico real dorme — os clones trabalham 24h/7 dias</w:t>
+        <w:t>4. Gerar videos ilimitados sem precisar gravar de novo</w:t>
       </w:r>
     </w:p>
     <w:p/>
@@ -266,7 +266,7 @@
         <w:rPr>
           <w:color w:val="333333"/>
         </w:rPr>
-        <w:t>O que já está construído como base:</w:t>
+        <w:t>Aplicacoes imediatas:</w:t>
       </w:r>
     </w:p>
     <w:tbl>
@@ -286,10 +286,7 @@
           </w:tcPr>
           <w:p>
             <w:r>
-              <w:rPr>
-                <w:b/>
-              </w:rPr>
-              <w:t>Componente</w:t>
+              <w:t>Local</w:t>
             </w:r>
           </w:p>
         </w:tc>
@@ -299,10 +296,7 @@
           </w:tcPr>
           <w:p>
             <w:r>
-              <w:rPr>
-                <w:b/>
-              </w:rPr>
-              <w:t>Status</w:t>
+              <w:t>Conteudo do Clone</w:t>
             </w:r>
           </w:p>
         </w:tc>
@@ -314,7 +308,7 @@
           </w:tcPr>
           <w:p>
             <w:r>
-              <w:t>Ana coleta leads e qualifica (7 etapas)</w:t>
+              <w:t>Landing page (hormoneecosystem.com)</w:t>
             </w:r>
           </w:p>
         </w:tc>
@@ -324,7 +318,7 @@
           </w:tcPr>
           <w:p>
             <w:r>
-              <w:t>✅ Funcionando</w:t>
+              <w:t>Video apresentacao do implante hormonal</w:t>
             </w:r>
           </w:p>
         </w:tc>
@@ -336,7 +330,7 @@
           </w:tcPr>
           <w:p>
             <w:r>
-              <w:t>Referidos salvos e priorizados no banco</w:t>
+              <w:t>Area do Paciente — boas-vindas</w:t>
             </w:r>
           </w:p>
         </w:tc>
@@ -346,7 +340,7 @@
           </w:tcPr>
           <w:p>
             <w:r>
-              <w:t>✅ Estruturado</w:t>
+              <w:t>Clone recebendo o novo paciente</w:t>
             </w:r>
           </w:p>
         </w:tc>
@@ -358,7 +352,7 @@
           </w:tcPr>
           <w:p>
             <w:r>
-              <w:t>Admin com visão completa e filtros</w:t>
+              <w:t>WhatsApp — inicio da conversa</w:t>
             </w:r>
           </w:p>
         </w:tc>
@@ -368,7 +362,7 @@
           </w:tcPr>
           <w:p>
             <w:r>
-              <w:t>✅ Pronto</w:t>
+              <w:t>Video curto endossando a Ana</w:t>
             </w:r>
           </w:p>
         </w:tc>
@@ -380,7 +374,7 @@
           </w:tcPr>
           <w:p>
             <w:r>
-              <w:t>Áudio do Dr. Vinícius no início</w:t>
+              <w:t>Pos-consulta</w:t>
             </w:r>
           </w:p>
         </w:tc>
@@ -390,29 +384,7 @@
           </w:tcPr>
           <w:p>
             <w:r>
-              <w:t>🔲 Próximo passo</w:t>
-            </w:r>
-          </w:p>
-        </w:tc>
-      </w:tr>
-      <w:tr>
-        <w:tc>
-          <w:tcPr>
-            <w:tcW w:type="dxa" w:w="4320"/>
-          </w:tcPr>
-          <w:p>
-            <w:r>
-              <w:t>Clones especializados por região/nicho</w:t>
-            </w:r>
-          </w:p>
-        </w:tc>
-        <w:tc>
-          <w:tcPr>
-            <w:tcW w:type="dxa" w:w="4320"/>
-          </w:tcPr>
-          <w:p>
-            <w:r>
-              <w:t>🔲 Visão futura</w:t>
+              <w:t>Clone explicando proximos passos</w:t>
             </w:r>
           </w:p>
         </w:tc>
@@ -427,15 +399,85 @@
         <w:rPr>
           <w:color w:val="7B3FE4"/>
         </w:rPr>
-        <w:t>3. O Limite Legal — Telemedicina com Clone</w:t>
+        <w:t>3. Telemedicina — CFM Resolucao 2.314/2022</w:t>
       </w:r>
     </w:p>
     <w:p>
       <w:r>
         <w:rPr>
-          <w:sz w:val="22"/>
+          <w:b/>
+          <w:color w:val="008000"/>
         </w:rPr>
-        <w:t>Foi discutido o potencial de usar vídeo com IA (avatar clonado) para atendimentos de telemedicina em escala. Porém, isso esbarra em limitações legais importantes no Brasil.</w:t>
+        <w:t>CORRECAO: CFM AUTORIZA TELEMEDICINA DEFINITIVAMENTE desde 2022.</w:t>
+      </w:r>
+    </w:p>
+    <w:p/>
+    <w:p>
+      <w:r>
+        <w:t>A Resolucao CFM 2.314/2022 regulamentou definitivamente a telemedicina no Brasil. Teleconsulta com o medico real e 100% legal.</w:t>
+      </w:r>
+    </w:p>
+    <w:p>
+      <w:pPr>
+        <w:pStyle w:val="Heading2"/>
+      </w:pPr>
+      <w:r>
+        <w:rPr>
+          <w:color w:val="333333"/>
+        </w:rPr>
+        <w:t>O que e PERMITIDO:</w:t>
+      </w:r>
+    </w:p>
+    <w:p>
+      <w:pPr>
+        <w:pStyle w:val="ListBullet"/>
+      </w:pPr>
+      <w:r>
+        <w:t>Teleconsulta com Dr. Vinicius real via video — totalmente legal (CFM 2.314/2022)</w:t>
+      </w:r>
+    </w:p>
+    <w:p>
+      <w:pPr>
+        <w:pStyle w:val="ListBullet"/>
+      </w:pPr>
+      <w:r>
+        <w:t>Ana qualifica o lead + agenda a teleconsulta automaticamente</w:t>
+      </w:r>
+    </w:p>
+    <w:p>
+      <w:pPr>
+        <w:pStyle w:val="ListBullet"/>
+      </w:pPr>
+      <w:r>
+        <w:t>Dr. Vinicius faz consulta de 15min com lead ja preparado e confiante</w:t>
+      </w:r>
+    </w:p>
+    <w:p>
+      <w:pPr>
+        <w:pStyle w:val="ListBullet"/>
+      </w:pPr>
+      <w:r>
+        <w:t>Clone em video para marketing, conteudo e area do paciente</w:t>
+      </w:r>
+    </w:p>
+    <w:p>
+      <w:pPr>
+        <w:pStyle w:val="Heading2"/>
+      </w:pPr>
+      <w:r>
+        <w:rPr>
+          <w:color w:val="333333"/>
+        </w:rPr>
+        <w:t>O que NAO e permitido:</w:t>
+      </w:r>
+    </w:p>
+    <w:p>
+      <w:r>
+        <w:rPr>
+          <w:b/>
+          <w:color w:val="CC0000"/>
+        </w:rPr>
+        <w:t>IA conduzir a consulta medica SOZINHA sem o medico presente — isso e ilegal.</w:t>
       </w:r>
     </w:p>
     <w:p/>
@@ -447,87 +489,7 @@
         <w:rPr>
           <w:color w:val="333333"/>
         </w:rPr>
-        <w:t>O que é tecnicamente possível hoje:</w:t>
-      </w:r>
-    </w:p>
-    <w:p>
-      <w:pPr>
-        <w:pStyle w:val="ListBullet"/>
-      </w:pPr>
-      <w:r>
-        <w:t>Voz clonada com IA ✅</w:t>
-      </w:r>
-    </w:p>
-    <w:p>
-      <w:pPr>
-        <w:pStyle w:val="ListBullet"/>
-      </w:pPr>
-      <w:r>
-        <w:t>Avatar em vídeo com IA (HeyGen, Synthesia) ✅</w:t>
-      </w:r>
-    </w:p>
-    <w:p>
-      <w:pPr>
-        <w:pStyle w:val="ListBullet"/>
-      </w:pPr>
-      <w:r>
-        <w:t>Agente de texto em escala ✅ (já temos com Ana)</w:t>
-      </w:r>
-    </w:p>
-    <w:p/>
-    <w:p>
-      <w:pPr>
-        <w:pStyle w:val="Heading2"/>
-      </w:pPr>
-      <w:r>
-        <w:rPr>
-          <w:color w:val="333333"/>
-        </w:rPr>
-        <w:t>O problema crítico — Proibição pelo CFM:</w:t>
-      </w:r>
-    </w:p>
-    <w:p>
-      <w:pPr>
-        <w:pStyle w:val="ListBullet"/>
-      </w:pPr>
-      <w:r>
-        <w:t>Consulta médica exige presença real ou teleconferência com o médico real</w:t>
-      </w:r>
-    </w:p>
-    <w:p>
-      <w:pPr>
-        <w:pStyle w:val="ListBullet"/>
-      </w:pPr>
-      <w:r>
-        <w:t>Um avatar/clone conduzindo consulta = exercício ilegal da medicina</w:t>
-      </w:r>
-    </w:p>
-    <w:p>
-      <w:pPr>
-        <w:pStyle w:val="ListBullet"/>
-      </w:pPr>
-      <w:r>
-        <w:t>Risco de cassação do CRM</w:t>
-      </w:r>
-    </w:p>
-    <w:p>
-      <w:pPr>
-        <w:pStyle w:val="ListBullet"/>
-      </w:pPr>
-      <w:r>
-        <w:t>Responsabilidade civil e criminal</w:t>
-      </w:r>
-    </w:p>
-    <w:p/>
-    <w:p>
-      <w:pPr>
-        <w:pStyle w:val="Heading2"/>
-      </w:pPr>
-      <w:r>
-        <w:rPr>
-          <w:color w:val="333333"/>
-        </w:rPr>
-        <w:t>A estratégia legal e escalável correta:</w:t>
+        <w:t>A estrategia completa e legal:</w:t>
       </w:r>
     </w:p>
     <w:tbl>
@@ -547,9 +509,6 @@
           </w:tcPr>
           <w:p>
             <w:r>
-              <w:rPr>
-                <w:b/>
-              </w:rPr>
               <w:t>Etapa</w:t>
             </w:r>
           </w:p>
@@ -560,10 +519,7 @@
           </w:tcPr>
           <w:p>
             <w:r>
-              <w:rPr>
-                <w:b/>
-              </w:rPr>
-              <w:t>Responsável</w:t>
+              <w:t>Responsavel</w:t>
             </w:r>
           </w:p>
         </w:tc>
@@ -575,7 +531,7 @@
           </w:tcPr>
           <w:p>
             <w:r>
-              <w:t>Ana qualifica o lead (7 etapas completas)</w:t>
+              <w:t>Ana qualifica o lead (7 etapas)</w:t>
             </w:r>
           </w:p>
         </w:tc>
@@ -585,7 +541,7 @@
           </w:tcPr>
           <w:p>
             <w:r>
-              <w:t>Ana IA ✅</w:t>
+              <w:t>Ana IA — automatico</w:t>
             </w:r>
           </w:p>
         </w:tc>
@@ -597,7 +553,7 @@
           </w:tcPr>
           <w:p>
             <w:r>
-              <w:t>Áudio/vídeo do Dr. Vinícius endossando</w:t>
+              <w:t>Clone em video na landing e area do paciente</w:t>
             </w:r>
           </w:p>
         </w:tc>
@@ -607,7 +563,7 @@
           </w:tcPr>
           <w:p>
             <w:r>
-              <w:t>Dr. Vinícius (gravado) ✅</w:t>
+              <w:t>Dr. Vinicius clone IA</w:t>
             </w:r>
           </w:p>
         </w:tc>
@@ -619,7 +575,7 @@
           </w:tcPr>
           <w:p>
             <w:r>
-              <w:t>Agendamento automático de teleconsulta</w:t>
+              <w:t>Agendamento automatico de teleconsulta</w:t>
             </w:r>
           </w:p>
         </w:tc>
@@ -629,7 +585,7 @@
           </w:tcPr>
           <w:p>
             <w:r>
-              <w:t>Sistema automático ✅</w:t>
+              <w:t>Sistema automatico</w:t>
             </w:r>
           </w:p>
         </w:tc>
@@ -641,7 +597,7 @@
           </w:tcPr>
           <w:p>
             <w:r>
-              <w:t>Consulta real de 15min com lead quente</w:t>
+              <w:t>Teleconsulta real 15min (CFM 2.314/2022)</w:t>
             </w:r>
           </w:p>
         </w:tc>
@@ -651,7 +607,7 @@
           </w:tcPr>
           <w:p>
             <w:r>
-              <w:t>Dr. Vinícius real ✅</w:t>
+              <w:t>Dr. Vinicius real — 100% legal</w:t>
             </w:r>
           </w:p>
         </w:tc>
@@ -663,7 +619,7 @@
           </w:tcPr>
           <w:p>
             <w:r>
-              <w:t>Pós-consulta e acompanhamento</w:t>
+              <w:t>Pos-consulta e acompanhamento</w:t>
             </w:r>
           </w:p>
         </w:tc>
@@ -673,21 +629,12 @@
           </w:tcPr>
           <w:p>
             <w:r>
-              <w:t>Ana IA ✅</w:t>
+              <w:t>Ana IA — automatico</w:t>
             </w:r>
           </w:p>
         </w:tc>
       </w:tr>
     </w:tbl>
-    <w:p/>
-    <w:p>
-      <w:r>
-        <w:rPr>
-          <w:sz w:val="22"/>
-        </w:rPr>
-        <w:t>Ana faz 95% do trabalho → Dr. Vinícius aparece só no momento decisivo → fecha com muito mais eficiência porque o lead já chegou preparado, confiante e qualificado.</w:t>
-      </w:r>
-    </w:p>
     <w:p/>
     <w:p>
       <w:pPr>
@@ -697,15 +644,44 @@
         <w:rPr>
           <w:color w:val="7B3FE4"/>
         </w:rPr>
-        <w:t>4. O Impacto em Números</w:t>
+        <w:t>4. Visao: Escala Total</w:t>
       </w:r>
     </w:p>
     <w:p>
       <w:r>
-        <w:rPr>
-          <w:sz w:val="22"/>
-        </w:rPr>
-        <w:t>A diferença entre o modelo tradicional e o modelo com IA:</w:t>
+        <w:t>Com telemedicina legal + clone em video + Ana qualificando 24h, o modelo completo fica:</w:t>
+      </w:r>
+    </w:p>
+    <w:p>
+      <w:pPr>
+        <w:pStyle w:val="ListBullet"/>
+      </w:pPr>
+      <w:r>
+        <w:t>Ana atende 2.000+ leads simultaneamente — custo quase zero</w:t>
+      </w:r>
+    </w:p>
+    <w:p>
+      <w:pPr>
+        <w:pStyle w:val="ListBullet"/>
+      </w:pPr>
+      <w:r>
+        <w:t>Clone do Dr. Vinicius presente em toda landing page e area do paciente</w:t>
+      </w:r>
+    </w:p>
+    <w:p>
+      <w:pPr>
+        <w:pStyle w:val="ListBullet"/>
+      </w:pPr>
+      <w:r>
+        <w:t>Dr. Vinicius real faz apenas teleconsultas — lead ja qualificado e confiante</w:t>
+      </w:r>
+    </w:p>
+    <w:p>
+      <w:pPr>
+        <w:pStyle w:val="ListBullet"/>
+      </w:pPr>
+      <w:r>
+        <w:t>Taxa de conversao alta pois o lead chega preparado em todas as etapas</w:t>
       </w:r>
     </w:p>
     <w:p/>
@@ -727,10 +703,7 @@
           </w:tcPr>
           <w:p>
             <w:r>
-              <w:rPr>
-                <w:b/>
-              </w:rPr>
-              <w:t>Métrica</w:t>
+              <w:t>Metrica</w:t>
             </w:r>
           </w:p>
         </w:tc>
@@ -740,9 +713,6 @@
           </w:tcPr>
           <w:p>
             <w:r>
-              <w:rPr>
-                <w:b/>
-              </w:rPr>
               <w:t>Modelo Tradicional</w:t>
             </w:r>
           </w:p>
@@ -753,10 +723,7 @@
           </w:tcPr>
           <w:p>
             <w:r>
-              <w:rPr>
-                <w:b/>
-              </w:rPr>
-              <w:t>Com Ana + Dr. Vinícius IA</w:t>
+              <w:t>Com Ana + Clone + Teleconsulta</w:t>
             </w:r>
           </w:p>
         </w:tc>
@@ -768,7 +735,7 @@
           </w:tcPr>
           <w:p>
             <w:r>
-              <w:t>Atendimentos por dia</w:t>
+              <w:t>Atendimentos/dia</w:t>
             </w:r>
           </w:p>
         </w:tc>
@@ -788,7 +755,7 @@
           </w:tcPr>
           <w:p>
             <w:r>
-              <w:t>2.000+ leads simultâneos</w:t>
+              <w:t>2.000+ leads simultaneos</w:t>
             </w:r>
           </w:p>
         </w:tc>
@@ -800,7 +767,7 @@
           </w:tcPr>
           <w:p>
             <w:r>
-              <w:t>Custo por atendimento</w:t>
+              <w:t>Custo por lead</w:t>
             </w:r>
           </w:p>
         </w:tc>
@@ -810,7 +777,7 @@
           </w:tcPr>
           <w:p>
             <w:r>
-              <w:t>Alto (tempo do médico)</w:t>
+              <w:t>Alto</w:t>
             </w:r>
           </w:p>
         </w:tc>
@@ -842,7 +809,7 @@
           </w:tcPr>
           <w:p>
             <w:r>
-              <w:t>Horário comercial</w:t>
+              <w:t>Horario comercial</w:t>
             </w:r>
           </w:p>
         </w:tc>
@@ -857,31 +824,46 @@
           </w:p>
         </w:tc>
       </w:tr>
+      <w:tr>
+        <w:tc>
+          <w:tcPr>
+            <w:tcW w:type="dxa" w:w="2880"/>
+          </w:tcPr>
+          <w:p>
+            <w:r>
+              <w:t>Presenca do Dr.</w:t>
+            </w:r>
+          </w:p>
+        </w:tc>
+        <w:tc>
+          <w:tcPr>
+            <w:tcW w:type="dxa" w:w="2880"/>
+          </w:tcPr>
+          <w:p>
+            <w:r>
+              <w:t>Apenas consulta</w:t>
+            </w:r>
+          </w:p>
+        </w:tc>
+        <w:tc>
+          <w:tcPr>
+            <w:tcW w:type="dxa" w:w="2880"/>
+          </w:tcPr>
+          <w:p>
+            <w:r>
+              <w:t>Em todo o funil (clone + real)</w:t>
+            </w:r>
+          </w:p>
+        </w:tc>
+      </w:tr>
     </w:tbl>
-    <w:p/>
     <w:p/>
     <w:p>
       <w:pPr>
         <w:jc w:val="center"/>
       </w:pPr>
       <w:r>
-        <w:rPr>
-          <w:color w:val="999999"/>
-          <w:sz w:val="18"/>
-        </w:rPr>
-        <w:t>Documento gerado em sessão de desenvolvimento — Hormone Ecosystem</w:t>
-      </w:r>
-    </w:p>
-    <w:p>
-      <w:pPr>
-        <w:jc w:val="center"/>
-      </w:pPr>
-      <w:r>
-        <w:rPr>
-          <w:color w:val="999999"/>
-          <w:sz w:val="18"/>
-        </w:rPr>
-        <w:t>19/06/2026 — hormoneecosystem.com</w:t>
+        <w:t>Atualizado em 19/06/2026 — Hormone Ecosystem</w:t>
       </w:r>
     </w:p>
     <w:sectPr>

</xml_diff>

<commit_message>
docs: visao estrategica v3 - clone Dr. Vinicius nos 7 passos + teleconsulta
</commit_message>
<xml_diff>
--- a/docs/visao-audio-clone-ia.docx
+++ b/docs/visao-audio-clone-ia.docx
@@ -16,7 +16,10 @@
         <w:jc w:val="center"/>
       </w:pPr>
       <w:r>
-        <w:t>Visao Estrategica v2 — Audio + Clone IA + Telemedicina Legal</w:t>
+        <w:rPr>
+          <w:color w:val="71717A"/>
+        </w:rPr>
+        <w:t>Visao Estrategica v3 — Clone do Dr. Vinicius nos 7 Passos + Teleconsulta Legal</w:t>
       </w:r>
     </w:p>
     <w:p>
@@ -24,7 +27,11 @@
         <w:jc w:val="center"/>
       </w:pPr>
       <w:r>
-        <w:t>19/06/2026 | Dr. Vinicius Cechella</w:t>
+        <w:rPr>
+          <w:color w:val="999999"/>
+          <w:sz w:val="20"/>
+        </w:rPr>
+        <w:t>19/06/2026  |  Dr. Vinicius Cechella</w:t>
       </w:r>
     </w:p>
     <w:p/>
@@ -36,12 +43,22 @@
         <w:rPr>
           <w:color w:val="7B3FE4"/>
         </w:rPr>
-        <w:t>1. Audio do Dr. Vinicius no Inicio da Conversa</w:t>
+        <w:t>1. A Visao Central — O Clone do Dr. Vinicius como Vendedor</w:t>
       </w:r>
     </w:p>
     <w:p>
       <w:r>
-        <w:t>Gravar audio com a voz do Dr. Vinicius para disparar automaticamente no inicio de cada conversa com a Ana (agente IA).</w:t>
+        <w:rPr>
+          <w:b/>
+          <w:color w:val="7B3FE4"/>
+        </w:rPr>
+        <w:t>IDEIA: Em vez de uma IA de texto (Ana), o lead conversa com um clone em VIDEO do Dr. Vinicius conduzindo os 7 passos.</w:t>
+      </w:r>
+    </w:p>
+    <w:p/>
+    <w:p>
+      <w:r>
+        <w:t>O lead nao fala com um chatbot — ele ve o rosto, ouve a voz e sente a presenca do Dr. Vinicius em cada etapa da conversa. O clone nao esta praticando medicina: esta qualificando, apresentando o produto e construindo confianca — exatamente como uma consultora faria, mas com a autoridade do proprio medico.</w:t>
       </w:r>
     </w:p>
     <w:p/>
@@ -53,30 +70,7 @@
         <w:rPr>
           <w:color w:val="333333"/>
         </w:rPr>
-        <w:t>Script sugerido:</w:t>
-      </w:r>
-    </w:p>
-    <w:p>
-      <w:pPr>
-        <w:ind w:left="720"/>
-      </w:pPr>
-      <w:r>
-        <w:rPr>
-          <w:i/>
-          <w:color w:val="555555"/>
-        </w:rPr>
-        <w:t>"Ola, aqui e o Dr. Vinicius Cechella. Obrigado por estar conversando com a Ana hoje. Ela e minha consultora e tem toda a minha confianca. Estou aqui no consultorio acompanhando cada conversa. Se precisar de mim, e so falar!"</w:t>
-      </w:r>
-    </w:p>
-    <w:p>
-      <w:pPr>
-        <w:pStyle w:val="Heading2"/>
-      </w:pPr>
-      <w:r>
-        <w:rPr>
-          <w:color w:val="333333"/>
-        </w:rPr>
-        <w:t>Por que e poderoso:</w:t>
+        <w:t>Por que isso e revolucionario:</w:t>
       </w:r>
     </w:p>
     <w:p>
@@ -84,7 +78,7 @@
         <w:pStyle w:val="ListBullet"/>
       </w:pPr>
       <w:r>
-        <w:t>Humaniza a conversa — lead percebe que ha um medico real por tras</w:t>
+        <w:t>Confianca maxima desde o primeiro segundo — o lead ve o medico real</w:t>
       </w:r>
     </w:p>
     <w:p>
@@ -92,7 +86,7 @@
         <w:pStyle w:val="ListBullet"/>
       </w:pPr>
       <w:r>
-        <w:t>Gera confianca imediata — Dr. Vinicius endossa e autoriza a Ana</w:t>
+        <w:t>Elimina 100% da objecao "Isso e um bot?" — e o rosto do Dr. Vinicius</w:t>
       </w:r>
     </w:p>
     <w:p>
@@ -100,7 +94,7 @@
         <w:pStyle w:val="ListBullet"/>
       </w:pPr>
       <w:r>
-        <w:t>Elimina objecoes: "Isso e um bot?" e "Posso confiar?"</w:t>
+        <w:t>Taxa de conversao muito mais alta — autoridade medica em cada etapa</w:t>
       </w:r>
     </w:p>
     <w:p>
@@ -108,18 +102,7 @@
         <w:pStyle w:val="ListBullet"/>
       </w:pPr>
       <w:r>
-        <w:t>Diferencia totalmente de outros chatbots</w:t>
-      </w:r>
-    </w:p>
-    <w:p>
-      <w:pPr>
-        <w:pStyle w:val="Heading2"/>
-      </w:pPr>
-      <w:r>
-        <w:rPr>
-          <w:color w:val="333333"/>
-        </w:rPr>
-        <w:t>Fluxo:</w:t>
+        <w:t>Escalavel — o clone atende 2.000 leads ao mesmo tempo</w:t>
       </w:r>
     </w:p>
     <w:p>
@@ -127,23 +110,7 @@
         <w:pStyle w:val="ListBullet"/>
       </w:pPr>
       <w:r>
-        <w:t>1. Lead manda primeira mensagem</w:t>
-      </w:r>
-    </w:p>
-    <w:p>
-      <w:pPr>
-        <w:pStyle w:val="ListBullet"/>
-      </w:pPr>
-      <w:r>
-        <w:t>2. Audio do Dr. Vinicius dispara automaticamente (n8n + Z-API)</w:t>
-      </w:r>
-    </w:p>
-    <w:p>
-      <w:pPr>
-        <w:pStyle w:val="ListBullet"/>
-      </w:pPr>
-      <w:r>
-        <w:t>3. Ana entra com Etapa 1 na sequencia</w:t>
+        <w:t>Custo quase zero por atendimento apos o clone criado</w:t>
       </w:r>
     </w:p>
     <w:p/>
@@ -155,343 +122,15 @@
         <w:rPr>
           <w:color w:val="7B3FE4"/>
         </w:rPr>
-        <w:t>2. Clone em Video IA — Marketing, Area do Paciente e Landing Page</w:t>
+        <w:t>2. Os 7 Passos com o Clone do Dr. Vinicius</w:t>
       </w:r>
     </w:p>
     <w:p>
       <w:r>
-        <w:rPr>
-          <w:b/>
-          <w:color w:val="008000"/>
-        </w:rPr>
-        <w:t>STATUS LEGAL: 100% PERMITIDO — Uso para marketing e conteudo nao e consulta medica.</w:t>
+        <w:t>Cada etapa do funil e conduzida pelo clone em video do Dr. Vinicius, com mensagens de voz ou video curto personalizado:</w:t>
       </w:r>
     </w:p>
     <w:p/>
-    <w:p>
-      <w:r>
-        <w:t>O Dr. Vinicius pode criar um clone identico usando HeyGen, Synthesia ou D-ID para uso em:</w:t>
-      </w:r>
-    </w:p>
-    <w:p>
-      <w:pPr>
-        <w:pStyle w:val="ListBullet"/>
-      </w:pPr>
-      <w:r>
-        <w:t>Landing page — video de apresentacao do implante hormonal</w:t>
-      </w:r>
-    </w:p>
-    <w:p>
-      <w:pPr>
-        <w:pStyle w:val="ListBullet"/>
-      </w:pPr>
-      <w:r>
-        <w:t>Area do paciente — boas-vindas personalizadas</w:t>
-      </w:r>
-    </w:p>
-    <w:p>
-      <w:pPr>
-        <w:pStyle w:val="ListBullet"/>
-      </w:pPr>
-      <w:r>
-        <w:t>WhatsApp — video curto endossando a Ana no inicio da conversa</w:t>
-      </w:r>
-    </w:p>
-    <w:p>
-      <w:pPr>
-        <w:pStyle w:val="ListBullet"/>
-      </w:pPr>
-      <w:r>
-        <w:t>Pos-consulta — clone explicando proximos passos do tratamento</w:t>
-      </w:r>
-    </w:p>
-    <w:p>
-      <w:pPr>
-        <w:pStyle w:val="ListBullet"/>
-      </w:pPr>
-      <w:r>
-        <w:t>Conteudo educativo em multiplos idiomas e formatos</w:t>
-      </w:r>
-    </w:p>
-    <w:p/>
-    <w:p>
-      <w:pPr>
-        <w:pStyle w:val="Heading2"/>
-      </w:pPr>
-      <w:r>
-        <w:rPr>
-          <w:color w:val="333333"/>
-        </w:rPr>
-        <w:t>Como funciona:</w:t>
-      </w:r>
-    </w:p>
-    <w:p>
-      <w:pPr>
-        <w:pStyle w:val="ListBullet"/>
-      </w:pPr>
-      <w:r>
-        <w:t>1. Gravar 10-15 minutos de video com boa iluminacao e audio</w:t>
-      </w:r>
-    </w:p>
-    <w:p>
-      <w:pPr>
-        <w:pStyle w:val="ListBullet"/>
-      </w:pPr>
-      <w:r>
-        <w:t>2. Subir no HeyGen — cria o clone digital identico</w:t>
-      </w:r>
-    </w:p>
-    <w:p>
-      <w:pPr>
-        <w:pStyle w:val="ListBullet"/>
-      </w:pPr>
-      <w:r>
-        <w:t>3. Digitar qualquer texto — o clone fala com sua voz e expressoes</w:t>
-      </w:r>
-    </w:p>
-    <w:p>
-      <w:pPr>
-        <w:pStyle w:val="ListBullet"/>
-      </w:pPr>
-      <w:r>
-        <w:t>4. Gerar videos ilimitados sem precisar gravar de novo</w:t>
-      </w:r>
-    </w:p>
-    <w:p/>
-    <w:p>
-      <w:pPr>
-        <w:pStyle w:val="Heading2"/>
-      </w:pPr>
-      <w:r>
-        <w:rPr>
-          <w:color w:val="333333"/>
-        </w:rPr>
-        <w:t>Aplicacoes imediatas:</w:t>
-      </w:r>
-    </w:p>
-    <w:tbl>
-      <w:tblPr>
-        <w:tblStyle w:val="TableGrid"/>
-        <w:tblW w:type="auto" w:w="0"/>
-        <w:tblLook w:firstColumn="1" w:firstRow="1" w:lastColumn="0" w:lastRow="0" w:noHBand="0" w:noVBand="1" w:val="04A0"/>
-      </w:tblPr>
-      <w:tblGrid>
-        <w:gridCol w:w="4320"/>
-        <w:gridCol w:w="4320"/>
-      </w:tblGrid>
-      <w:tr>
-        <w:tc>
-          <w:tcPr>
-            <w:tcW w:type="dxa" w:w="4320"/>
-          </w:tcPr>
-          <w:p>
-            <w:r>
-              <w:t>Local</w:t>
-            </w:r>
-          </w:p>
-        </w:tc>
-        <w:tc>
-          <w:tcPr>
-            <w:tcW w:type="dxa" w:w="4320"/>
-          </w:tcPr>
-          <w:p>
-            <w:r>
-              <w:t>Conteudo do Clone</w:t>
-            </w:r>
-          </w:p>
-        </w:tc>
-      </w:tr>
-      <w:tr>
-        <w:tc>
-          <w:tcPr>
-            <w:tcW w:type="dxa" w:w="4320"/>
-          </w:tcPr>
-          <w:p>
-            <w:r>
-              <w:t>Landing page (hormoneecosystem.com)</w:t>
-            </w:r>
-          </w:p>
-        </w:tc>
-        <w:tc>
-          <w:tcPr>
-            <w:tcW w:type="dxa" w:w="4320"/>
-          </w:tcPr>
-          <w:p>
-            <w:r>
-              <w:t>Video apresentacao do implante hormonal</w:t>
-            </w:r>
-          </w:p>
-        </w:tc>
-      </w:tr>
-      <w:tr>
-        <w:tc>
-          <w:tcPr>
-            <w:tcW w:type="dxa" w:w="4320"/>
-          </w:tcPr>
-          <w:p>
-            <w:r>
-              <w:t>Area do Paciente — boas-vindas</w:t>
-            </w:r>
-          </w:p>
-        </w:tc>
-        <w:tc>
-          <w:tcPr>
-            <w:tcW w:type="dxa" w:w="4320"/>
-          </w:tcPr>
-          <w:p>
-            <w:r>
-              <w:t>Clone recebendo o novo paciente</w:t>
-            </w:r>
-          </w:p>
-        </w:tc>
-      </w:tr>
-      <w:tr>
-        <w:tc>
-          <w:tcPr>
-            <w:tcW w:type="dxa" w:w="4320"/>
-          </w:tcPr>
-          <w:p>
-            <w:r>
-              <w:t>WhatsApp — inicio da conversa</w:t>
-            </w:r>
-          </w:p>
-        </w:tc>
-        <w:tc>
-          <w:tcPr>
-            <w:tcW w:type="dxa" w:w="4320"/>
-          </w:tcPr>
-          <w:p>
-            <w:r>
-              <w:t>Video curto endossando a Ana</w:t>
-            </w:r>
-          </w:p>
-        </w:tc>
-      </w:tr>
-      <w:tr>
-        <w:tc>
-          <w:tcPr>
-            <w:tcW w:type="dxa" w:w="4320"/>
-          </w:tcPr>
-          <w:p>
-            <w:r>
-              <w:t>Pos-consulta</w:t>
-            </w:r>
-          </w:p>
-        </w:tc>
-        <w:tc>
-          <w:tcPr>
-            <w:tcW w:type="dxa" w:w="4320"/>
-          </w:tcPr>
-          <w:p>
-            <w:r>
-              <w:t>Clone explicando proximos passos</w:t>
-            </w:r>
-          </w:p>
-        </w:tc>
-      </w:tr>
-    </w:tbl>
-    <w:p/>
-    <w:p>
-      <w:pPr>
-        <w:pStyle w:val="Heading1"/>
-      </w:pPr>
-      <w:r>
-        <w:rPr>
-          <w:color w:val="7B3FE4"/>
-        </w:rPr>
-        <w:t>3. Telemedicina — CFM Resolucao 2.314/2022</w:t>
-      </w:r>
-    </w:p>
-    <w:p>
-      <w:r>
-        <w:rPr>
-          <w:b/>
-          <w:color w:val="008000"/>
-        </w:rPr>
-        <w:t>CORRECAO: CFM AUTORIZA TELEMEDICINA DEFINITIVAMENTE desde 2022.</w:t>
-      </w:r>
-    </w:p>
-    <w:p/>
-    <w:p>
-      <w:r>
-        <w:t>A Resolucao CFM 2.314/2022 regulamentou definitivamente a telemedicina no Brasil. Teleconsulta com o medico real e 100% legal.</w:t>
-      </w:r>
-    </w:p>
-    <w:p>
-      <w:pPr>
-        <w:pStyle w:val="Heading2"/>
-      </w:pPr>
-      <w:r>
-        <w:rPr>
-          <w:color w:val="333333"/>
-        </w:rPr>
-        <w:t>O que e PERMITIDO:</w:t>
-      </w:r>
-    </w:p>
-    <w:p>
-      <w:pPr>
-        <w:pStyle w:val="ListBullet"/>
-      </w:pPr>
-      <w:r>
-        <w:t>Teleconsulta com Dr. Vinicius real via video — totalmente legal (CFM 2.314/2022)</w:t>
-      </w:r>
-    </w:p>
-    <w:p>
-      <w:pPr>
-        <w:pStyle w:val="ListBullet"/>
-      </w:pPr>
-      <w:r>
-        <w:t>Ana qualifica o lead + agenda a teleconsulta automaticamente</w:t>
-      </w:r>
-    </w:p>
-    <w:p>
-      <w:pPr>
-        <w:pStyle w:val="ListBullet"/>
-      </w:pPr>
-      <w:r>
-        <w:t>Dr. Vinicius faz consulta de 15min com lead ja preparado e confiante</w:t>
-      </w:r>
-    </w:p>
-    <w:p>
-      <w:pPr>
-        <w:pStyle w:val="ListBullet"/>
-      </w:pPr>
-      <w:r>
-        <w:t>Clone em video para marketing, conteudo e area do paciente</w:t>
-      </w:r>
-    </w:p>
-    <w:p>
-      <w:pPr>
-        <w:pStyle w:val="Heading2"/>
-      </w:pPr>
-      <w:r>
-        <w:rPr>
-          <w:color w:val="333333"/>
-        </w:rPr>
-        <w:t>O que NAO e permitido:</w:t>
-      </w:r>
-    </w:p>
-    <w:p>
-      <w:r>
-        <w:rPr>
-          <w:b/>
-          <w:color w:val="CC0000"/>
-        </w:rPr>
-        <w:t>IA conduzir a consulta medica SOZINHA sem o medico presente — isso e ilegal.</w:t>
-      </w:r>
-    </w:p>
-    <w:p/>
-    <w:p>
-      <w:pPr>
-        <w:pStyle w:val="Heading2"/>
-      </w:pPr>
-      <w:r>
-        <w:rPr>
-          <w:color w:val="333333"/>
-        </w:rPr>
-        <w:t>A estrategia completa e legal:</w:t>
-      </w:r>
-    </w:p>
     <w:tbl>
       <w:tblPr>
         <w:tblStyle w:val="TableGrid"/>
@@ -519,7 +158,7 @@
           </w:tcPr>
           <w:p>
             <w:r>
-              <w:t>Responsavel</w:t>
+              <w:t>O que o Clone do Dr. Vinicius faz</w:t>
             </w:r>
           </w:p>
         </w:tc>
@@ -531,7 +170,7 @@
           </w:tcPr>
           <w:p>
             <w:r>
-              <w:t>Ana qualifica o lead (7 etapas)</w:t>
+              <w:t>Etapa 1 — Apresentacao</w:t>
             </w:r>
           </w:p>
         </w:tc>
@@ -541,7 +180,7 @@
           </w:tcPr>
           <w:p>
             <w:r>
-              <w:t>Ana IA — automatico</w:t>
+              <w:t>Clone se apresenta, coleta o nome, cria conexao imediata</w:t>
             </w:r>
           </w:p>
         </w:tc>
@@ -553,7 +192,7 @@
           </w:tcPr>
           <w:p>
             <w:r>
-              <w:t>Clone em video na landing e area do paciente</w:t>
+              <w:t>Etapa 2 — Conexao</w:t>
             </w:r>
           </w:p>
         </w:tc>
@@ -563,7 +202,7 @@
           </w:tcPr>
           <w:p>
             <w:r>
-              <w:t>Dr. Vinicius clone IA</w:t>
+              <w:t>Clone faz rapport, pergunta sobre profissao e dores</w:t>
             </w:r>
           </w:p>
         </w:tc>
@@ -575,7 +214,7 @@
           </w:tcPr>
           <w:p>
             <w:r>
-              <w:t>Agendamento automatico de teleconsulta</w:t>
+              <w:t>Etapa 3 — D.I.</w:t>
             </w:r>
           </w:p>
         </w:tc>
@@ -585,7 +224,7 @@
           </w:tcPr>
           <w:p>
             <w:r>
-              <w:t>Sistema automatico</w:t>
+              <w:t>Clone aprofunda a dor principal com empatia medica</w:t>
             </w:r>
           </w:p>
         </w:tc>
@@ -597,7 +236,7 @@
           </w:tcPr>
           <w:p>
             <w:r>
-              <w:t>Teleconsulta real 15min (CFM 2.314/2022)</w:t>
+              <w:t>Etapa 4 — Speech</w:t>
             </w:r>
           </w:p>
         </w:tc>
@@ -607,7 +246,7 @@
           </w:tcPr>
           <w:p>
             <w:r>
-              <w:t>Dr. Vinicius real — 100% legal</w:t>
+              <w:t>Clone apresenta o implante hormonal com autoridade</w:t>
             </w:r>
           </w:p>
         </w:tc>
@@ -619,7 +258,7 @@
           </w:tcPr>
           <w:p>
             <w:r>
-              <w:t>Pos-consulta e acompanhamento</w:t>
+              <w:t>Etapa 5 — Fechamento</w:t>
             </w:r>
           </w:p>
         </w:tc>
@@ -629,7 +268,387 @@
           </w:tcPr>
           <w:p>
             <w:r>
-              <w:t>Ana IA — automatico</w:t>
+              <w:t>Clone apresenta preco e forma de pagamento</w:t>
+            </w:r>
+          </w:p>
+        </w:tc>
+      </w:tr>
+      <w:tr>
+        <w:tc>
+          <w:tcPr>
+            <w:tcW w:type="dxa" w:w="4320"/>
+          </w:tcPr>
+          <w:p>
+            <w:r>
+              <w:t>Etapa 6 — Referidos</w:t>
+            </w:r>
+          </w:p>
+        </w:tc>
+        <w:tc>
+          <w:tcPr>
+            <w:tcW w:type="dxa" w:w="4320"/>
+          </w:tcPr>
+          <w:p>
+            <w:r>
+              <w:t>Clone pede os 20 contatos de forma natural e confiavel</w:t>
+            </w:r>
+          </w:p>
+        </w:tc>
+      </w:tr>
+      <w:tr>
+        <w:tc>
+          <w:tcPr>
+            <w:tcW w:type="dxa" w:w="4320"/>
+          </w:tcPr>
+          <w:p>
+            <w:r>
+              <w:t>Etapa 7 — Validacao</w:t>
+            </w:r>
+          </w:p>
+        </w:tc>
+        <w:tc>
+          <w:tcPr>
+            <w:tcW w:type="dxa" w:w="4320"/>
+          </w:tcPr>
+          <w:p>
+            <w:r>
+              <w:t>Clone confirma dados, tira duvidas, encaminha para teleconsulta</w:t>
+            </w:r>
+          </w:p>
+        </w:tc>
+      </w:tr>
+    </w:tbl>
+    <w:p/>
+    <w:p>
+      <w:pPr>
+        <w:pStyle w:val="Heading2"/>
+      </w:pPr>
+      <w:r>
+        <w:rPr>
+          <w:color w:val="333333"/>
+        </w:rPr>
+        <w:t>Formato de cada interacao:</w:t>
+      </w:r>
+    </w:p>
+    <w:p>
+      <w:pPr>
+        <w:pStyle w:val="ListBullet"/>
+      </w:pPr>
+      <w:r>
+        <w:t>Video curto (15-30s) do clone para cada etapa — gerado pelo HeyGen</w:t>
+      </w:r>
+    </w:p>
+    <w:p>
+      <w:pPr>
+        <w:pStyle w:val="ListBullet"/>
+      </w:pPr>
+      <w:r>
+        <w:t>Ou audio com voz clonada — mais rapido de gerar e igualmente eficaz</w:t>
+      </w:r>
+    </w:p>
+    <w:p>
+      <w:pPr>
+        <w:pStyle w:val="ListBullet"/>
+      </w:pPr>
+      <w:r>
+        <w:t>Texto de apoio quando necessario para coleta de dados</w:t>
+      </w:r>
+    </w:p>
+    <w:p/>
+    <w:p>
+      <w:pPr>
+        <w:pStyle w:val="Heading1"/>
+      </w:pPr>
+      <w:r>
+        <w:rPr>
+          <w:color w:val="7B3FE4"/>
+        </w:rPr>
+        <w:t>3. Teleconsulta para Fechar — CFM Resolucao 2.314/2022</w:t>
+      </w:r>
+    </w:p>
+    <w:p>
+      <w:r>
+        <w:rPr>
+          <w:b/>
+          <w:color w:val="008000"/>
+        </w:rPr>
+        <w:t>CFM AUTORIZA: Teleconsulta com medico real e 100% legal (Resolucao 2.314/2022).</w:t>
+      </w:r>
+    </w:p>
+    <w:p/>
+    <w:p>
+      <w:r>
+        <w:t>Quando o lead tem duvidas que o clone nao pode responder — ou quando esta quase fechando e precisa do ultimo empurrao — o Dr. Vinicius REAL entra ao vivo via teleconsulta.</w:t>
+      </w:r>
+    </w:p>
+    <w:p/>
+    <w:p>
+      <w:pPr>
+        <w:pStyle w:val="Heading2"/>
+      </w:pPr>
+      <w:r>
+        <w:rPr>
+          <w:color w:val="333333"/>
+        </w:rPr>
+        <w:t>Como funciona o momento da teleconsulta:</w:t>
+      </w:r>
+    </w:p>
+    <w:p>
+      <w:pPr>
+        <w:pStyle w:val="ListBullet"/>
+      </w:pPr>
+      <w:r>
+        <w:t>1. Clone conduz os 7 passos e qualifica totalmente o lead</w:t>
+      </w:r>
+    </w:p>
+    <w:p>
+      <w:pPr>
+        <w:pStyle w:val="ListBullet"/>
+      </w:pPr>
+      <w:r>
+        <w:t>2. Lead fica com duvida medica especifica OU esta pronto para fechar</w:t>
+      </w:r>
+    </w:p>
+    <w:p>
+      <w:pPr>
+        <w:pStyle w:val="ListBullet"/>
+      </w:pPr>
+      <w:r>
+        <w:t>3. Clone agenda automaticamente a teleconsulta com Dr. Vinicius real</w:t>
+      </w:r>
+    </w:p>
+    <w:p>
+      <w:pPr>
+        <w:pStyle w:val="ListBullet"/>
+      </w:pPr>
+      <w:r>
+        <w:t>4. Dr. Vinicius entra por 10-15 minutos — lead ja confiante, ja qualificado</w:t>
+      </w:r>
+    </w:p>
+    <w:p>
+      <w:pPr>
+        <w:pStyle w:val="ListBullet"/>
+      </w:pPr>
+      <w:r>
+        <w:t>5. Fechamento acontece com taxa de conversao altissima</w:t>
+      </w:r>
+    </w:p>
+    <w:p/>
+    <w:p>
+      <w:pPr>
+        <w:pStyle w:val="Heading2"/>
+      </w:pPr>
+      <w:r>
+        <w:rPr>
+          <w:color w:val="333333"/>
+        </w:rPr>
+        <w:t>Por que a teleconsulta no final e poderosa:</w:t>
+      </w:r>
+    </w:p>
+    <w:p>
+      <w:pPr>
+        <w:pStyle w:val="ListBullet"/>
+      </w:pPr>
+      <w:r>
+        <w:t>Lead passou pelos 7 passos com o ROSTO do Dr. Vinicius — ja e familiar</w:t>
+      </w:r>
+    </w:p>
+    <w:p>
+      <w:pPr>
+        <w:pStyle w:val="ListBullet"/>
+      </w:pPr>
+      <w:r>
+        <w:t>Quando o Dr. Vinicius real aparece, e como encontrar um amigo de confianca</w:t>
+      </w:r>
+    </w:p>
+    <w:p>
+      <w:pPr>
+        <w:pStyle w:val="ListBullet"/>
+      </w:pPr>
+      <w:r>
+        <w:t>Duvidas medicas respondidas por quem realmente pode responder</w:t>
+      </w:r>
+    </w:p>
+    <w:p>
+      <w:pPr>
+        <w:pStyle w:val="ListBullet"/>
+      </w:pPr>
+      <w:r>
+        <w:t>Fechamento natural — nao e uma venda forcada, e uma consulta</w:t>
+      </w:r>
+    </w:p>
+    <w:p/>
+    <w:p>
+      <w:pPr>
+        <w:pStyle w:val="Heading1"/>
+      </w:pPr>
+      <w:r>
+        <w:rPr>
+          <w:color w:val="7B3FE4"/>
+        </w:rPr>
+        <w:t>4. O Que e Legal e O Que Nao e</w:t>
+      </w:r>
+    </w:p>
+    <w:tbl>
+      <w:tblPr>
+        <w:tblStyle w:val="TableGrid"/>
+        <w:tblW w:type="auto" w:w="0"/>
+        <w:tblLook w:firstColumn="1" w:firstRow="1" w:lastColumn="0" w:lastRow="0" w:noHBand="0" w:noVBand="1" w:val="04A0"/>
+      </w:tblPr>
+      <w:tblGrid>
+        <w:gridCol w:w="4320"/>
+        <w:gridCol w:w="4320"/>
+      </w:tblGrid>
+      <w:tr>
+        <w:tc>
+          <w:tcPr>
+            <w:tcW w:type="dxa" w:w="4320"/>
+          </w:tcPr>
+          <w:p>
+            <w:r>
+              <w:t>Acao</w:t>
+            </w:r>
+          </w:p>
+        </w:tc>
+        <w:tc>
+          <w:tcPr>
+            <w:tcW w:type="dxa" w:w="4320"/>
+          </w:tcPr>
+          <w:p>
+            <w:r>
+              <w:t>Status Legal</w:t>
+            </w:r>
+          </w:p>
+        </w:tc>
+      </w:tr>
+      <w:tr>
+        <w:tc>
+          <w:tcPr>
+            <w:tcW w:type="dxa" w:w="4320"/>
+          </w:tcPr>
+          <w:p>
+            <w:r>
+              <w:t>Clone nos 7 passos — qualificacao e apresentacao</w:t>
+            </w:r>
+          </w:p>
+        </w:tc>
+        <w:tc>
+          <w:tcPr>
+            <w:tcW w:type="dxa" w:w="4320"/>
+          </w:tcPr>
+          <w:p>
+            <w:r>
+              <w:t>LEGAL — nao e consulta medica</w:t>
+            </w:r>
+          </w:p>
+        </w:tc>
+      </w:tr>
+      <w:tr>
+        <w:tc>
+          <w:tcPr>
+            <w:tcW w:type="dxa" w:w="4320"/>
+          </w:tcPr>
+          <w:p>
+            <w:r>
+              <w:t>Clone na landing page e area do paciente</w:t>
+            </w:r>
+          </w:p>
+        </w:tc>
+        <w:tc>
+          <w:tcPr>
+            <w:tcW w:type="dxa" w:w="4320"/>
+          </w:tcPr>
+          <w:p>
+            <w:r>
+              <w:t>LEGAL — e conteudo/marketing</w:t>
+            </w:r>
+          </w:p>
+        </w:tc>
+      </w:tr>
+      <w:tr>
+        <w:tc>
+          <w:tcPr>
+            <w:tcW w:type="dxa" w:w="4320"/>
+          </w:tcPr>
+          <w:p>
+            <w:r>
+              <w:t>Clone respondendo duvidas sobre o produto</w:t>
+            </w:r>
+          </w:p>
+        </w:tc>
+        <w:tc>
+          <w:tcPr>
+            <w:tcW w:type="dxa" w:w="4320"/>
+          </w:tcPr>
+          <w:p>
+            <w:r>
+              <w:t>LEGAL — e informacao comercial</w:t>
+            </w:r>
+          </w:p>
+        </w:tc>
+      </w:tr>
+      <w:tr>
+        <w:tc>
+          <w:tcPr>
+            <w:tcW w:type="dxa" w:w="4320"/>
+          </w:tcPr>
+          <w:p>
+            <w:r>
+              <w:t>Teleconsulta ao vivo com Dr. Vinicius real</w:t>
+            </w:r>
+          </w:p>
+        </w:tc>
+        <w:tc>
+          <w:tcPr>
+            <w:tcW w:type="dxa" w:w="4320"/>
+          </w:tcPr>
+          <w:p>
+            <w:r>
+              <w:t>LEGAL — CFM 2.314/2022</w:t>
+            </w:r>
+          </w:p>
+        </w:tc>
+      </w:tr>
+      <w:tr>
+        <w:tc>
+          <w:tcPr>
+            <w:tcW w:type="dxa" w:w="4320"/>
+          </w:tcPr>
+          <w:p>
+            <w:r>
+              <w:t>Clone diagnosticando ou prescrevendo</w:t>
+            </w:r>
+          </w:p>
+        </w:tc>
+        <w:tc>
+          <w:tcPr>
+            <w:tcW w:type="dxa" w:w="4320"/>
+          </w:tcPr>
+          <w:p>
+            <w:r>
+              <w:t>PROIBIDO — exercicio ilegal da medicina</w:t>
+            </w:r>
+          </w:p>
+        </w:tc>
+      </w:tr>
+      <w:tr>
+        <w:tc>
+          <w:tcPr>
+            <w:tcW w:type="dxa" w:w="4320"/>
+          </w:tcPr>
+          <w:p>
+            <w:r>
+              <w:t>Clone conduzindo consulta medica sozinho</w:t>
+            </w:r>
+          </w:p>
+        </w:tc>
+        <w:tc>
+          <w:tcPr>
+            <w:tcW w:type="dxa" w:w="4320"/>
+          </w:tcPr>
+          <w:p>
+            <w:r>
+              <w:t>PROIBIDO — CFM nao permite</w:t>
             </w:r>
           </w:p>
         </w:tc>
@@ -644,47 +663,342 @@
         <w:rPr>
           <w:color w:val="7B3FE4"/>
         </w:rPr>
-        <w:t>4. Visao: Escala Total</w:t>
+        <w:t>5. O Fluxo Completo — Do Lead ao Fechamento</w:t>
       </w:r>
     </w:p>
+    <w:tbl>
+      <w:tblPr>
+        <w:tblStyle w:val="TableGrid"/>
+        <w:tblW w:type="auto" w:w="0"/>
+        <w:tblLook w:firstColumn="1" w:firstRow="1" w:lastColumn="0" w:lastRow="0" w:noHBand="0" w:noVBand="1" w:val="04A0"/>
+      </w:tblPr>
+      <w:tblGrid>
+        <w:gridCol w:w="4320"/>
+        <w:gridCol w:w="4320"/>
+      </w:tblGrid>
+      <w:tr>
+        <w:tc>
+          <w:tcPr>
+            <w:tcW w:type="dxa" w:w="4320"/>
+          </w:tcPr>
+          <w:p>
+            <w:r>
+              <w:t>Momento</w:t>
+            </w:r>
+          </w:p>
+        </w:tc>
+        <w:tc>
+          <w:tcPr>
+            <w:tcW w:type="dxa" w:w="4320"/>
+          </w:tcPr>
+          <w:p>
+            <w:r>
+              <w:t>O que acontece</w:t>
+            </w:r>
+          </w:p>
+        </w:tc>
+      </w:tr>
+      <w:tr>
+        <w:tc>
+          <w:tcPr>
+            <w:tcW w:type="dxa" w:w="4320"/>
+          </w:tcPr>
+          <w:p>
+            <w:r>
+              <w:t>Lead entra no WhatsApp</w:t>
+            </w:r>
+          </w:p>
+        </w:tc>
+        <w:tc>
+          <w:tcPr>
+            <w:tcW w:type="dxa" w:w="4320"/>
+          </w:tcPr>
+          <w:p>
+            <w:r>
+              <w:t>Clone do Dr. Vinicius aparece — audio ou video de boas-vindas</w:t>
+            </w:r>
+          </w:p>
+        </w:tc>
+      </w:tr>
+      <w:tr>
+        <w:tc>
+          <w:tcPr>
+            <w:tcW w:type="dxa" w:w="4320"/>
+          </w:tcPr>
+          <w:p>
+            <w:r>
+              <w:t>Etapas 1 a 6</w:t>
+            </w:r>
+          </w:p>
+        </w:tc>
+        <w:tc>
+          <w:tcPr>
+            <w:tcW w:type="dxa" w:w="4320"/>
+          </w:tcPr>
+          <w:p>
+            <w:r>
+              <w:t>Clone conduz o funil completo com voz e rosto do Dr. Vinicius</w:t>
+            </w:r>
+          </w:p>
+        </w:tc>
+      </w:tr>
+      <w:tr>
+        <w:tc>
+          <w:tcPr>
+            <w:tcW w:type="dxa" w:w="4320"/>
+          </w:tcPr>
+          <w:p>
+            <w:r>
+              <w:t>Etapa 7 — Duvidas</w:t>
+            </w:r>
+          </w:p>
+        </w:tc>
+        <w:tc>
+          <w:tcPr>
+            <w:tcW w:type="dxa" w:w="4320"/>
+          </w:tcPr>
+          <w:p>
+            <w:r>
+              <w:t>Clone tira duvidas sobre o produto (nao medicas)</w:t>
+            </w:r>
+          </w:p>
+        </w:tc>
+      </w:tr>
+      <w:tr>
+        <w:tc>
+          <w:tcPr>
+            <w:tcW w:type="dxa" w:w="4320"/>
+          </w:tcPr>
+          <w:p>
+            <w:r>
+              <w:t>Duvida medica especifica</w:t>
+            </w:r>
+          </w:p>
+        </w:tc>
+        <w:tc>
+          <w:tcPr>
+            <w:tcW w:type="dxa" w:w="4320"/>
+          </w:tcPr>
+          <w:p>
+            <w:r>
+              <w:t>Clone agenda teleconsulta com Dr. Vinicius real</w:t>
+            </w:r>
+          </w:p>
+        </w:tc>
+      </w:tr>
+      <w:tr>
+        <w:tc>
+          <w:tcPr>
+            <w:tcW w:type="dxa" w:w="4320"/>
+          </w:tcPr>
+          <w:p>
+            <w:r>
+              <w:t>Teleconsulta 10-15min</w:t>
+            </w:r>
+          </w:p>
+        </w:tc>
+        <w:tc>
+          <w:tcPr>
+            <w:tcW w:type="dxa" w:w="4320"/>
+          </w:tcPr>
+          <w:p>
+            <w:r>
+              <w:t>Dr. Vinicius real fecha o implante — lead ja preparado</w:t>
+            </w:r>
+          </w:p>
+        </w:tc>
+      </w:tr>
+      <w:tr>
+        <w:tc>
+          <w:tcPr>
+            <w:tcW w:type="dxa" w:w="4320"/>
+          </w:tcPr>
+          <w:p>
+            <w:r>
+              <w:t>Pos-fechamento</w:t>
+            </w:r>
+          </w:p>
+        </w:tc>
+        <w:tc>
+          <w:tcPr>
+            <w:tcW w:type="dxa" w:w="4320"/>
+          </w:tcPr>
+          <w:p>
+            <w:r>
+              <w:t>Clone ou Ana IA faz acompanhamento e coleta referidos</w:t>
+            </w:r>
+          </w:p>
+        </w:tc>
+      </w:tr>
+    </w:tbl>
+    <w:p/>
+    <w:p/>
     <w:p>
+      <w:pPr>
+        <w:pStyle w:val="Heading1"/>
+      </w:pPr>
       <w:r>
-        <w:t>Com telemedicina legal + clone em video + Ana qualificando 24h, o modelo completo fica:</w:t>
+        <w:rPr>
+          <w:color w:val="7B3FE4"/>
+        </w:rPr>
+        <w:t>6. Ferramentas para Criar o Clone</w:t>
       </w:r>
     </w:p>
+    <w:tbl>
+      <w:tblPr>
+        <w:tblStyle w:val="TableGrid"/>
+        <w:tblW w:type="auto" w:w="0"/>
+        <w:tblLook w:firstColumn="1" w:firstRow="1" w:lastColumn="0" w:lastRow="0" w:noHBand="0" w:noVBand="1" w:val="04A0"/>
+      </w:tblPr>
+      <w:tblGrid>
+        <w:gridCol w:w="4320"/>
+        <w:gridCol w:w="4320"/>
+      </w:tblGrid>
+      <w:tr>
+        <w:tc>
+          <w:tcPr>
+            <w:tcW w:type="dxa" w:w="4320"/>
+          </w:tcPr>
+          <w:p>
+            <w:r>
+              <w:t>Ferramenta</w:t>
+            </w:r>
+          </w:p>
+        </w:tc>
+        <w:tc>
+          <w:tcPr>
+            <w:tcW w:type="dxa" w:w="4320"/>
+          </w:tcPr>
+          <w:p>
+            <w:r>
+              <w:t>Para que usar</w:t>
+            </w:r>
+          </w:p>
+        </w:tc>
+      </w:tr>
+      <w:tr>
+        <w:tc>
+          <w:tcPr>
+            <w:tcW w:type="dxa" w:w="4320"/>
+          </w:tcPr>
+          <w:p>
+            <w:r>
+              <w:t>HeyGen</w:t>
+            </w:r>
+          </w:p>
+        </w:tc>
+        <w:tc>
+          <w:tcPr>
+            <w:tcW w:type="dxa" w:w="4320"/>
+          </w:tcPr>
+          <w:p>
+            <w:r>
+              <w:t>Criar clone identico em video — o mais avancado do mercado</w:t>
+            </w:r>
+          </w:p>
+        </w:tc>
+      </w:tr>
+      <w:tr>
+        <w:tc>
+          <w:tcPr>
+            <w:tcW w:type="dxa" w:w="4320"/>
+          </w:tcPr>
+          <w:p>
+            <w:r>
+              <w:t>ElevenLabs</w:t>
+            </w:r>
+          </w:p>
+        </w:tc>
+        <w:tc>
+          <w:tcPr>
+            <w:tcW w:type="dxa" w:w="4320"/>
+          </w:tcPr>
+          <w:p>
+            <w:r>
+              <w:t>Clonar apenas a voz para audios no WhatsApp</w:t>
+            </w:r>
+          </w:p>
+        </w:tc>
+      </w:tr>
+      <w:tr>
+        <w:tc>
+          <w:tcPr>
+            <w:tcW w:type="dxa" w:w="4320"/>
+          </w:tcPr>
+          <w:p>
+            <w:r>
+              <w:t>Synthesia</w:t>
+            </w:r>
+          </w:p>
+        </w:tc>
+        <w:tc>
+          <w:tcPr>
+            <w:tcW w:type="dxa" w:w="4320"/>
+          </w:tcPr>
+          <w:p>
+            <w:r>
+              <w:t>Alternativa ao HeyGen para videos em escala</w:t>
+            </w:r>
+          </w:p>
+        </w:tc>
+      </w:tr>
+      <w:tr>
+        <w:tc>
+          <w:tcPr>
+            <w:tcW w:type="dxa" w:w="4320"/>
+          </w:tcPr>
+          <w:p>
+            <w:r>
+              <w:t>D-ID</w:t>
+            </w:r>
+          </w:p>
+        </w:tc>
+        <w:tc>
+          <w:tcPr>
+            <w:tcW w:type="dxa" w:w="4320"/>
+          </w:tcPr>
+          <w:p>
+            <w:r>
+              <w:t>Criar avatares animados a partir de foto</w:t>
+            </w:r>
+          </w:p>
+        </w:tc>
+      </w:tr>
+      <w:tr>
+        <w:tc>
+          <w:tcPr>
+            <w:tcW w:type="dxa" w:w="4320"/>
+          </w:tcPr>
+          <w:p>
+            <w:r>
+              <w:t>n8n + Z-API</w:t>
+            </w:r>
+          </w:p>
+        </w:tc>
+        <w:tc>
+          <w:tcPr>
+            <w:tcW w:type="dxa" w:w="4320"/>
+          </w:tcPr>
+          <w:p>
+            <w:r>
+              <w:t>Orquestrar o envio dos videos/audios no fluxo do WhatsApp</w:t>
+            </w:r>
+          </w:p>
+        </w:tc>
+      </w:tr>
+    </w:tbl>
+    <w:p/>
     <w:p>
       <w:pPr>
-        <w:pStyle w:val="ListBullet"/>
+        <w:pStyle w:val="Heading1"/>
       </w:pPr>
       <w:r>
-        <w:t>Ana atende 2.000+ leads simultaneamente — custo quase zero</w:t>
+        <w:rPr>
+          <w:color w:val="7B3FE4"/>
+        </w:rPr>
+        <w:t>7. Impacto em Numeros</w:t>
       </w:r>
     </w:p>
-    <w:p>
-      <w:pPr>
-        <w:pStyle w:val="ListBullet"/>
-      </w:pPr>
-      <w:r>
-        <w:t>Clone do Dr. Vinicius presente em toda landing page e area do paciente</w:t>
-      </w:r>
-    </w:p>
-    <w:p>
-      <w:pPr>
-        <w:pStyle w:val="ListBullet"/>
-      </w:pPr>
-      <w:r>
-        <w:t>Dr. Vinicius real faz apenas teleconsultas — lead ja qualificado e confiante</w:t>
-      </w:r>
-    </w:p>
-    <w:p>
-      <w:pPr>
-        <w:pStyle w:val="ListBullet"/>
-      </w:pPr>
-      <w:r>
-        <w:t>Taxa de conversao alta pois o lead chega preparado em todas as etapas</w:t>
-      </w:r>
-    </w:p>
-    <w:p/>
     <w:tbl>
       <w:tblPr>
         <w:tblStyle w:val="TableGrid"/>
@@ -713,7 +1027,7 @@
           </w:tcPr>
           <w:p>
             <w:r>
-              <w:t>Modelo Tradicional</w:t>
+              <w:t>Hoje (Ana texto)</w:t>
             </w:r>
           </w:p>
         </w:tc>
@@ -723,7 +1037,7 @@
           </w:tcPr>
           <w:p>
             <w:r>
-              <w:t>Com Ana + Clone + Teleconsulta</w:t>
+              <w:t>Com Clone Video + Teleconsulta</w:t>
             </w:r>
           </w:p>
         </w:tc>
@@ -735,7 +1049,7 @@
           </w:tcPr>
           <w:p>
             <w:r>
-              <w:t>Atendimentos/dia</w:t>
+              <w:t>Confianca do lead</w:t>
             </w:r>
           </w:p>
         </w:tc>
@@ -745,7 +1059,7 @@
           </w:tcPr>
           <w:p>
             <w:r>
-              <w:t>20 pacientes</w:t>
+              <w:t>Media — texto de IA</w:t>
             </w:r>
           </w:p>
         </w:tc>
@@ -755,7 +1069,71 @@
           </w:tcPr>
           <w:p>
             <w:r>
-              <w:t>2.000+ leads simultaneos</w:t>
+              <w:t>Maxima — rosto do medico</w:t>
+            </w:r>
+          </w:p>
+        </w:tc>
+      </w:tr>
+      <w:tr>
+        <w:tc>
+          <w:tcPr>
+            <w:tcW w:type="dxa" w:w="2880"/>
+          </w:tcPr>
+          <w:p>
+            <w:r>
+              <w:t>Taxa de conversao</w:t>
+            </w:r>
+          </w:p>
+        </w:tc>
+        <w:tc>
+          <w:tcPr>
+            <w:tcW w:type="dxa" w:w="2880"/>
+          </w:tcPr>
+          <w:p>
+            <w:r>
+              <w:t>X%</w:t>
+            </w:r>
+          </w:p>
+        </w:tc>
+        <w:tc>
+          <w:tcPr>
+            <w:tcW w:type="dxa" w:w="2880"/>
+          </w:tcPr>
+          <w:p>
+            <w:r>
+              <w:t>Estimativa: 2x a 3x maior</w:t>
+            </w:r>
+          </w:p>
+        </w:tc>
+      </w:tr>
+      <w:tr>
+        <w:tc>
+          <w:tcPr>
+            <w:tcW w:type="dxa" w:w="2880"/>
+          </w:tcPr>
+          <w:p>
+            <w:r>
+              <w:t>Atendimentos simultaneos</w:t>
+            </w:r>
+          </w:p>
+        </w:tc>
+        <w:tc>
+          <w:tcPr>
+            <w:tcW w:type="dxa" w:w="2880"/>
+          </w:tcPr>
+          <w:p>
+            <w:r>
+              <w:t>2.000+ leads</w:t>
+            </w:r>
+          </w:p>
+        </w:tc>
+        <w:tc>
+          <w:tcPr>
+            <w:tcW w:type="dxa" w:w="2880"/>
+          </w:tcPr>
+          <w:p>
+            <w:r>
+              <w:t>2.000+ leads</w:t>
             </w:r>
           </w:p>
         </w:tc>
@@ -777,7 +1155,7 @@
           </w:tcPr>
           <w:p>
             <w:r>
-              <w:t>Alto</w:t>
+              <w:t>Quase zero</w:t>
             </w:r>
           </w:p>
         </w:tc>
@@ -809,7 +1187,7 @@
           </w:tcPr>
           <w:p>
             <w:r>
-              <w:t>Horario comercial</w:t>
+              <w:t>24h / 7 dias</w:t>
             </w:r>
           </w:p>
         </w:tc>
@@ -831,7 +1209,7 @@
           </w:tcPr>
           <w:p>
             <w:r>
-              <w:t>Presenca do Dr.</w:t>
+              <w:t>Tempo do Dr. Vinicius</w:t>
             </w:r>
           </w:p>
         </w:tc>
@@ -841,7 +1219,7 @@
           </w:tcPr>
           <w:p>
             <w:r>
-              <w:t>Apenas consulta</w:t>
+              <w:t>Zero (so na teleconsulta)</w:t>
             </w:r>
           </w:p>
         </w:tc>
@@ -851,19 +1229,24 @@
           </w:tcPr>
           <w:p>
             <w:r>
-              <w:t>Em todo o funil (clone + real)</w:t>
+              <w:t>10-15min por fechamento</w:t>
             </w:r>
           </w:p>
         </w:tc>
       </w:tr>
     </w:tbl>
     <w:p/>
+    <w:p/>
     <w:p>
       <w:pPr>
         <w:jc w:val="center"/>
       </w:pPr>
       <w:r>
-        <w:t>Atualizado em 19/06/2026 — Hormone Ecosystem</w:t>
+        <w:rPr>
+          <w:color w:val="999999"/>
+          <w:sz w:val="18"/>
+        </w:rPr>
+        <w:t>Documento gerado em 19/06/2026 — Hormone Ecosystem — hormoneecosystem.com</w:t>
       </w:r>
     </w:p>
     <w:sectPr>

</xml_diff>